<commit_message>
Regenerate Clinical Trials outputs with submission docx
Co-Authored-By: Tatsuki Onishi <bougtoir@gmail.com>
</commit_message>
<xml_diff>
--- a/rct-decomposition/KOTHA_Framework_ClinicalTrials.docx
+++ b/rct-decomposition/KOTHA_Framework_ClinicalTrials.docx
@@ -88,7 +88,7 @@
           <w:i w:val="0"/>
           <w:sz w:val="24"/>
         </w:rPr>
-        <w:t>Word count: 2443</w:t>
+        <w:t>Word count: 2421</w:t>
       </w:r>
     </w:p>
     <w:p>
@@ -3606,7 +3606,38 @@
           <w:sz w:val="24"/>
           <w:szCs w:val="24"/>
         </w:rPr>
-        <w:t xml:space="preserve">of 0.80, below the conventional boundary of 1.96; under a random-effects accumulation the final</w:t>
+        <w:t xml:space="preserve">of 0.80, which did not cross the conventional two-sided boundary for benefit or harm (</w:t>
+      </w:r>
+      <m:oMath>
+        <m:d>
+          <m:dPr>
+            <m:begChr m:val="|"/>
+            <m:endChr m:val="|"/>
+            <m:sepChr m:val=""/>
+            <m:grow/>
+          </m:dPr>
+          <m:e>
+            <m:r>
+              <m:t>Z</m:t>
+            </m:r>
+          </m:e>
+        </m:d>
+      </m:oMath>
+      <w:r>
+        <w:rPr>
+          <w:rFonts w:ascii="Times New Roman" w:hAnsi="Times New Roman" w:cs="Times New Roman" w:eastAsia="Times New Roman"/>
+          <w:sz w:val="24"/>
+          <w:szCs w:val="24"/>
+        </w:rPr>
+        <w:t xml:space="preserve"> </w:t>
+      </w:r>
+      <w:r>
+        <w:rPr>
+          <w:rFonts w:ascii="Times New Roman" w:hAnsi="Times New Roman" w:cs="Times New Roman" w:eastAsia="Times New Roman"/>
+          <w:sz w:val="24"/>
+          <w:szCs w:val="24"/>
+        </w:rPr>
+        <w:t xml:space="preserve">= 1.96); under a random-effects accumulation the final</w:t>
       </w:r>
       <w:r>
         <w:rPr>
@@ -3635,7 +3666,7 @@
           <w:sz w:val="24"/>
           <w:szCs w:val="24"/>
         </w:rPr>
-        <w:t xml:space="preserve">was -2.90, crossing the O’Brien-Fleming boundary of 0.27 (Supplementary Fig. S2). This divergence reflects era-dependent treatment-effect heterogeneity driven by the ISIS-4 result.</w:t>
+        <w:t xml:space="preserve">was -2.90, crossing the lower O’Brien-Fleming boundary of -0.27 (Supplementary Fig. S2). This divergence reflects era-dependent treatment-effect heterogeneity driven by the ISIS-4 result.</w:t>
       </w:r>
     </w:p>
     <w:p xmlns:a="http://schemas.openxmlformats.org/drawingml/2006/main" xmlns:pic="http://schemas.openxmlformats.org/drawingml/2006/picture">

</xml_diff>

<commit_message>
Final Clinical Trials submission package: move Fig 1 inline, abbreviations as list, ignore highlights docx
Co-Authored-By: Tatsuki Onishi <bougtoir@gmail.com>
</commit_message>
<xml_diff>
--- a/rct-decomposition/KOTHA_Framework_ClinicalTrials.docx
+++ b/rct-decomposition/KOTHA_Framework_ClinicalTrials.docx
@@ -381,556 +381,318 @@
         <w:t>Abbreviations</w:t>
       </w:r>
     </w:p>
-    <w:tbl xmlns:a="http://schemas.openxmlformats.org/drawingml/2006/main" xmlns:pic="http://schemas.openxmlformats.org/drawingml/2006/picture">
-      <w:tblPr>
-        <w:tblStyle w:val="Table Grid"/>
-        <w:tblW w:type="pct" w:w="5000"/>
-        <w:tblLook w:firstRow="1" w:lastRow="0" w:firstColumn="0" w:lastColumn="0" w:noHBand="0" w:noVBand="0" w:val="0020"/>
-        <w:jc w:val="center"/>
-        <w:tblLayout w:type="fixed"/>
-      </w:tblPr>
-      <w:tblGrid>
-        <w:gridCol w:w="3960"/>
-        <w:gridCol w:w="3960"/>
-      </w:tblGrid>
-      <w:tr>
-        <w:trPr>
-          <w:tblHeader w:val="true"/>
-        </w:trPr>
-        <w:tc>
-          <w:tcPr/>
-          <w:p>
-            <w:pPr>
-              <w:pStyle w:val="Normal"/>
-              <w:jc w:val="left"/>
-              <w:spacing w:line="240" w:lineRule="auto" w:after="0"/>
-            </w:pPr>
-            <w:r>
-              <w:rPr>
-                <w:rFonts w:ascii="Times New Roman" w:hAnsi="Times New Roman" w:cs="Times New Roman" w:eastAsia="Times New Roman"/>
-                <w:sz w:val="20"/>
-                <w:szCs w:val="20"/>
-                <w:b/>
-              </w:rPr>
-              <w:t xml:space="preserve">Abbreviation</w:t>
-            </w:r>
-          </w:p>
-        </w:tc>
-        <w:tc>
-          <w:tcPr/>
-          <w:p>
-            <w:pPr>
-              <w:pStyle w:val="Normal"/>
-              <w:jc w:val="left"/>
-              <w:spacing w:line="240" w:lineRule="auto" w:after="0"/>
-            </w:pPr>
-            <w:r>
-              <w:rPr>
-                <w:rFonts w:ascii="Times New Roman" w:hAnsi="Times New Roman" w:cs="Times New Roman" w:eastAsia="Times New Roman"/>
-                <w:sz w:val="20"/>
-                <w:szCs w:val="20"/>
-                <w:b/>
-              </w:rPr>
-              <w:t xml:space="preserve">Definition</w:t>
-            </w:r>
-          </w:p>
-        </w:tc>
-      </w:tr>
-      <w:tr>
-        <w:tc>
-          <w:tcPr/>
-          <w:p>
-            <w:pPr>
-              <w:pStyle w:val="Normal"/>
-              <w:jc w:val="left"/>
-              <w:spacing w:line="240" w:lineRule="auto" w:after="0"/>
-            </w:pPr>
-            <w:r>
-              <w:rPr>
-                <w:rFonts w:ascii="Times New Roman" w:hAnsi="Times New Roman" w:cs="Times New Roman" w:eastAsia="Times New Roman"/>
-                <w:sz w:val="20"/>
-                <w:szCs w:val="20"/>
-              </w:rPr>
-              <w:t xml:space="preserve">ADEMP</w:t>
-            </w:r>
-          </w:p>
-        </w:tc>
-        <w:tc>
-          <w:tcPr/>
-          <w:p>
-            <w:pPr>
-              <w:pStyle w:val="Normal"/>
-              <w:jc w:val="left"/>
-              <w:spacing w:line="240" w:lineRule="auto" w:after="0"/>
-            </w:pPr>
-            <w:r>
-              <w:rPr>
-                <w:rFonts w:ascii="Times New Roman" w:hAnsi="Times New Roman" w:cs="Times New Roman" w:eastAsia="Times New Roman"/>
-                <w:sz w:val="20"/>
-                <w:szCs w:val="20"/>
-              </w:rPr>
-              <w:t xml:space="preserve">Aims, Data-generating mechanisms, Estimands, Methods, Performance measures</w:t>
-            </w:r>
-          </w:p>
-        </w:tc>
-      </w:tr>
-      <w:tr>
-        <w:tc>
-          <w:tcPr/>
-          <w:p>
-            <w:pPr>
-              <w:pStyle w:val="Normal"/>
-              <w:jc w:val="left"/>
-              <w:spacing w:line="240" w:lineRule="auto" w:after="0"/>
-            </w:pPr>
-            <w:r>
-              <w:rPr>
-                <w:rFonts w:ascii="Times New Roman" w:hAnsi="Times New Roman" w:cs="Times New Roman" w:eastAsia="Times New Roman"/>
-                <w:sz w:val="20"/>
-                <w:szCs w:val="20"/>
-              </w:rPr>
-              <w:t xml:space="preserve">AMI</w:t>
-            </w:r>
-          </w:p>
-        </w:tc>
-        <w:tc>
-          <w:tcPr/>
-          <w:p>
-            <w:pPr>
-              <w:pStyle w:val="Normal"/>
-              <w:jc w:val="left"/>
-              <w:spacing w:line="240" w:lineRule="auto" w:after="0"/>
-            </w:pPr>
-            <w:r>
-              <w:rPr>
-                <w:rFonts w:ascii="Times New Roman" w:hAnsi="Times New Roman" w:cs="Times New Roman" w:eastAsia="Times New Roman"/>
-                <w:sz w:val="20"/>
-                <w:szCs w:val="20"/>
-              </w:rPr>
-              <w:t xml:space="preserve">Acute myocardial infarction</w:t>
-            </w:r>
-          </w:p>
-        </w:tc>
-      </w:tr>
-      <w:tr>
-        <w:tc>
-          <w:tcPr/>
-          <w:p>
-            <w:pPr>
-              <w:pStyle w:val="Normal"/>
-              <w:jc w:val="left"/>
-              <w:spacing w:line="240" w:lineRule="auto" w:after="0"/>
-            </w:pPr>
-            <w:r>
-              <w:rPr>
-                <w:rFonts w:ascii="Times New Roman" w:hAnsi="Times New Roman" w:cs="Times New Roman" w:eastAsia="Times New Roman"/>
-                <w:sz w:val="20"/>
-                <w:szCs w:val="20"/>
-              </w:rPr>
-              <w:t xml:space="preserve">CrI</w:t>
-            </w:r>
-          </w:p>
-        </w:tc>
-        <w:tc>
-          <w:tcPr/>
-          <w:p>
-            <w:pPr>
-              <w:pStyle w:val="Normal"/>
-              <w:jc w:val="left"/>
-              <w:spacing w:line="240" w:lineRule="auto" w:after="0"/>
-            </w:pPr>
-            <w:r>
-              <w:rPr>
-                <w:rFonts w:ascii="Times New Roman" w:hAnsi="Times New Roman" w:cs="Times New Roman" w:eastAsia="Times New Roman"/>
-                <w:sz w:val="20"/>
-                <w:szCs w:val="20"/>
-              </w:rPr>
-              <w:t xml:space="preserve">Credible interval</w:t>
-            </w:r>
-          </w:p>
-        </w:tc>
-      </w:tr>
-      <w:tr>
-        <w:tc>
-          <w:tcPr/>
-          <w:p>
-            <w:pPr>
-              <w:pStyle w:val="Normal"/>
-              <w:jc w:val="left"/>
-              <w:spacing w:line="240" w:lineRule="auto" w:after="0"/>
-            </w:pPr>
-            <w:r>
-              <w:rPr>
-                <w:rFonts w:ascii="Times New Roman" w:hAnsi="Times New Roman" w:cs="Times New Roman" w:eastAsia="Times New Roman"/>
-                <w:sz w:val="20"/>
-                <w:szCs w:val="20"/>
-              </w:rPr>
-              <w:t xml:space="preserve">CI</w:t>
-            </w:r>
-          </w:p>
-        </w:tc>
-        <w:tc>
-          <w:tcPr/>
-          <w:p>
-            <w:pPr>
-              <w:pStyle w:val="Normal"/>
-              <w:jc w:val="left"/>
-              <w:spacing w:line="240" w:lineRule="auto" w:after="0"/>
-            </w:pPr>
-            <w:r>
-              <w:rPr>
-                <w:rFonts w:ascii="Times New Roman" w:hAnsi="Times New Roman" w:cs="Times New Roman" w:eastAsia="Times New Roman"/>
-                <w:sz w:val="20"/>
-                <w:szCs w:val="20"/>
-              </w:rPr>
-              <w:t xml:space="preserve">Confidence interval</w:t>
-            </w:r>
-          </w:p>
-        </w:tc>
-      </w:tr>
-      <w:tr>
-        <w:tc>
-          <w:tcPr/>
-          <w:p>
-            <w:pPr>
-              <w:pStyle w:val="Normal"/>
-              <w:jc w:val="left"/>
-              <w:spacing w:line="240" w:lineRule="auto" w:after="0"/>
-            </w:pPr>
-            <w:r>
-              <w:rPr>
-                <w:rFonts w:ascii="Times New Roman" w:hAnsi="Times New Roman" w:cs="Times New Roman" w:eastAsia="Times New Roman"/>
-                <w:sz w:val="20"/>
-                <w:szCs w:val="20"/>
-              </w:rPr>
-              <w:t xml:space="preserve">GRADE</w:t>
-            </w:r>
-          </w:p>
-        </w:tc>
-        <w:tc>
-          <w:tcPr/>
-          <w:p>
-            <w:pPr>
-              <w:pStyle w:val="Normal"/>
-              <w:jc w:val="left"/>
-              <w:spacing w:line="240" w:lineRule="auto" w:after="0"/>
-            </w:pPr>
-            <w:r>
-              <w:rPr>
-                <w:rFonts w:ascii="Times New Roman" w:hAnsi="Times New Roman" w:cs="Times New Roman" w:eastAsia="Times New Roman"/>
-                <w:sz w:val="20"/>
-                <w:szCs w:val="20"/>
-              </w:rPr>
-              <w:t xml:space="preserve">Grading of Recommendations Assessment, Development and Evaluation</w:t>
-            </w:r>
-          </w:p>
-        </w:tc>
-      </w:tr>
-      <w:tr>
-        <w:tc>
-          <w:tcPr/>
-          <w:p>
-            <w:pPr>
-              <w:pStyle w:val="Normal"/>
-              <w:jc w:val="left"/>
-              <w:spacing w:line="240" w:lineRule="auto" w:after="0"/>
-            </w:pPr>
-            <w:r>
-              <w:rPr>
-                <w:rFonts w:ascii="Times New Roman" w:hAnsi="Times New Roman" w:cs="Times New Roman" w:eastAsia="Times New Roman"/>
-                <w:sz w:val="20"/>
-                <w:szCs w:val="20"/>
-              </w:rPr>
-              <w:t xml:space="preserve">HF</w:t>
-            </w:r>
-          </w:p>
-        </w:tc>
-        <w:tc>
-          <w:tcPr/>
-          <w:p>
-            <w:pPr>
-              <w:pStyle w:val="Normal"/>
-              <w:jc w:val="left"/>
-              <w:spacing w:line="240" w:lineRule="auto" w:after="0"/>
-            </w:pPr>
-            <w:r>
-              <w:rPr>
-                <w:rFonts w:ascii="Times New Roman" w:hAnsi="Times New Roman" w:cs="Times New Roman" w:eastAsia="Times New Roman"/>
-                <w:sz w:val="20"/>
-                <w:szCs w:val="20"/>
-              </w:rPr>
-              <w:t xml:space="preserve">Heart failure</w:t>
-            </w:r>
-          </w:p>
-        </w:tc>
-      </w:tr>
-      <w:tr>
-        <w:tc>
-          <w:tcPr/>
-          <w:p>
-            <w:pPr>
-              <w:pStyle w:val="Normal"/>
-              <w:jc w:val="left"/>
-              <w:spacing w:line="240" w:lineRule="auto" w:after="0"/>
-            </w:pPr>
-            <w:r>
-              <w:rPr>
-                <w:rFonts w:ascii="Times New Roman" w:hAnsi="Times New Roman" w:cs="Times New Roman" w:eastAsia="Times New Roman"/>
-                <w:sz w:val="20"/>
-                <w:szCs w:val="20"/>
-              </w:rPr>
-              <w:t xml:space="preserve">HR</w:t>
-            </w:r>
-          </w:p>
-        </w:tc>
-        <w:tc>
-          <w:tcPr/>
-          <w:p>
-            <w:pPr>
-              <w:pStyle w:val="Normal"/>
-              <w:jc w:val="left"/>
-              <w:spacing w:line="240" w:lineRule="auto" w:after="0"/>
-            </w:pPr>
-            <w:r>
-              <w:rPr>
-                <w:rFonts w:ascii="Times New Roman" w:hAnsi="Times New Roman" w:cs="Times New Roman" w:eastAsia="Times New Roman"/>
-                <w:sz w:val="20"/>
-                <w:szCs w:val="20"/>
-              </w:rPr>
-              <w:t xml:space="preserve">Hazard ratio</w:t>
-            </w:r>
-          </w:p>
-        </w:tc>
-      </w:tr>
-      <w:tr>
-        <w:tc>
-          <w:tcPr/>
-          <w:p>
-            <w:pPr>
-              <w:pStyle w:val="Normal"/>
-              <w:jc w:val="left"/>
-              <w:spacing w:line="240" w:lineRule="auto" w:after="0"/>
-            </w:pPr>
-            <w:r>
-              <w:rPr>
-                <w:rFonts w:ascii="Times New Roman" w:hAnsi="Times New Roman" w:cs="Times New Roman" w:eastAsia="Times New Roman"/>
-                <w:sz w:val="20"/>
-                <w:szCs w:val="20"/>
-              </w:rPr>
-              <w:t xml:space="preserve">KOTHA</w:t>
-            </w:r>
-          </w:p>
-        </w:tc>
-        <w:tc>
-          <w:tcPr/>
-          <w:p>
-            <w:pPr>
-              <w:pStyle w:val="Normal"/>
-              <w:jc w:val="left"/>
-              <w:spacing w:line="240" w:lineRule="auto" w:after="0"/>
-            </w:pPr>
-            <w:r>
-              <w:rPr>
-                <w:rFonts w:ascii="Times New Roman" w:hAnsi="Times New Roman" w:cs="Times New Roman" w:eastAsia="Times New Roman"/>
-                <w:sz w:val="20"/>
-                <w:szCs w:val="20"/>
-              </w:rPr>
-              <w:t xml:space="preserve">Knowledge-driven Observational-Trial Harmonization Approach</w:t>
-            </w:r>
-          </w:p>
-        </w:tc>
-      </w:tr>
-      <w:tr>
-        <w:tc>
-          <w:tcPr/>
-          <w:p>
-            <w:pPr>
-              <w:pStyle w:val="Normal"/>
-              <w:jc w:val="left"/>
-              <w:spacing w:line="240" w:lineRule="auto" w:after="0"/>
-            </w:pPr>
-            <w:r>
-              <w:rPr>
-                <w:rFonts w:ascii="Times New Roman" w:hAnsi="Times New Roman" w:cs="Times New Roman" w:eastAsia="Times New Roman"/>
-                <w:sz w:val="20"/>
-                <w:szCs w:val="20"/>
-              </w:rPr>
-              <w:t xml:space="preserve">MCMC</w:t>
-            </w:r>
-          </w:p>
-        </w:tc>
-        <w:tc>
-          <w:tcPr/>
-          <w:p>
-            <w:pPr>
-              <w:pStyle w:val="Normal"/>
-              <w:jc w:val="left"/>
-              <w:spacing w:line="240" w:lineRule="auto" w:after="0"/>
-            </w:pPr>
-            <w:r>
-              <w:rPr>
-                <w:rFonts w:ascii="Times New Roman" w:hAnsi="Times New Roman" w:cs="Times New Roman" w:eastAsia="Times New Roman"/>
-                <w:sz w:val="20"/>
-                <w:szCs w:val="20"/>
-              </w:rPr>
-              <w:t xml:space="preserve">Markov chain Monte Carlo</w:t>
-            </w:r>
-          </w:p>
-        </w:tc>
-      </w:tr>
-      <w:tr>
-        <w:tc>
-          <w:tcPr/>
-          <w:p>
-            <w:pPr>
-              <w:pStyle w:val="Normal"/>
-              <w:jc w:val="left"/>
-              <w:spacing w:line="240" w:lineRule="auto" w:after="0"/>
-            </w:pPr>
-            <w:r>
-              <w:rPr>
-                <w:rFonts w:ascii="Times New Roman" w:hAnsi="Times New Roman" w:cs="Times New Roman" w:eastAsia="Times New Roman"/>
-                <w:sz w:val="20"/>
-                <w:szCs w:val="20"/>
-              </w:rPr>
-              <w:t xml:space="preserve">OIS</w:t>
-            </w:r>
-          </w:p>
-        </w:tc>
-        <w:tc>
-          <w:tcPr/>
-          <w:p>
-            <w:pPr>
-              <w:pStyle w:val="Normal"/>
-              <w:jc w:val="left"/>
-              <w:spacing w:line="240" w:lineRule="auto" w:after="0"/>
-            </w:pPr>
-            <w:r>
-              <w:rPr>
-                <w:rFonts w:ascii="Times New Roman" w:hAnsi="Times New Roman" w:cs="Times New Roman" w:eastAsia="Times New Roman"/>
-                <w:sz w:val="20"/>
-                <w:szCs w:val="20"/>
-              </w:rPr>
-              <w:t xml:space="preserve">Optimal information size</w:t>
-            </w:r>
-          </w:p>
-        </w:tc>
-      </w:tr>
-      <w:tr>
-        <w:tc>
-          <w:tcPr/>
-          <w:p>
-            <w:pPr>
-              <w:pStyle w:val="Normal"/>
-              <w:jc w:val="left"/>
-              <w:spacing w:line="240" w:lineRule="auto" w:after="0"/>
-            </w:pPr>
-            <w:r>
-              <w:rPr>
-                <w:rFonts w:ascii="Times New Roman" w:hAnsi="Times New Roman" w:cs="Times New Roman" w:eastAsia="Times New Roman"/>
-                <w:sz w:val="20"/>
-                <w:szCs w:val="20"/>
-              </w:rPr>
-              <w:t xml:space="preserve">OR</w:t>
-            </w:r>
-          </w:p>
-        </w:tc>
-        <w:tc>
-          <w:tcPr/>
-          <w:p>
-            <w:pPr>
-              <w:pStyle w:val="Normal"/>
-              <w:jc w:val="left"/>
-              <w:spacing w:line="240" w:lineRule="auto" w:after="0"/>
-            </w:pPr>
-            <w:r>
-              <w:rPr>
-                <w:rFonts w:ascii="Times New Roman" w:hAnsi="Times New Roman" w:cs="Times New Roman" w:eastAsia="Times New Roman"/>
-                <w:sz w:val="20"/>
-                <w:szCs w:val="20"/>
-              </w:rPr>
-              <w:t xml:space="preserve">Odds ratio</w:t>
-            </w:r>
-          </w:p>
-        </w:tc>
-      </w:tr>
-      <w:tr>
-        <w:tc>
-          <w:tcPr/>
-          <w:p>
-            <w:pPr>
-              <w:pStyle w:val="Normal"/>
-              <w:jc w:val="left"/>
-              <w:spacing w:line="240" w:lineRule="auto" w:after="0"/>
-            </w:pPr>
-            <w:r>
-              <w:rPr>
-                <w:rFonts w:ascii="Times New Roman" w:hAnsi="Times New Roman" w:cs="Times New Roman" w:eastAsia="Times New Roman"/>
-                <w:sz w:val="20"/>
-                <w:szCs w:val="20"/>
-              </w:rPr>
-              <w:t xml:space="preserve">RCT</w:t>
-            </w:r>
-          </w:p>
-        </w:tc>
-        <w:tc>
-          <w:tcPr/>
-          <w:p>
-            <w:pPr>
-              <w:pStyle w:val="Normal"/>
-              <w:jc w:val="left"/>
-              <w:spacing w:line="240" w:lineRule="auto" w:after="0"/>
-            </w:pPr>
-            <w:r>
-              <w:rPr>
-                <w:rFonts w:ascii="Times New Roman" w:hAnsi="Times New Roman" w:cs="Times New Roman" w:eastAsia="Times New Roman"/>
-                <w:sz w:val="20"/>
-                <w:szCs w:val="20"/>
-              </w:rPr>
-              <w:t xml:space="preserve">Randomized controlled trial</w:t>
-            </w:r>
-          </w:p>
-        </w:tc>
-      </w:tr>
-      <w:tr>
-        <w:tc>
-          <w:tcPr/>
-          <w:p>
-            <w:pPr>
-              <w:pStyle w:val="Normal"/>
-              <w:jc w:val="left"/>
-              <w:spacing w:line="240" w:lineRule="auto" w:after="0"/>
-            </w:pPr>
-            <w:r>
-              <w:rPr>
-                <w:rFonts w:ascii="Times New Roman" w:hAnsi="Times New Roman" w:cs="Times New Roman" w:eastAsia="Times New Roman"/>
-                <w:sz w:val="20"/>
-                <w:szCs w:val="20"/>
-              </w:rPr>
-              <w:t xml:space="preserve">TSA</w:t>
-            </w:r>
-          </w:p>
-        </w:tc>
-        <w:tc>
-          <w:tcPr/>
-          <w:p>
-            <w:pPr>
-              <w:pStyle w:val="Normal"/>
-              <w:jc w:val="left"/>
-              <w:spacing w:line="240" w:lineRule="auto" w:after="0"/>
-            </w:pPr>
-            <w:r>
-              <w:rPr>
-                <w:rFonts w:ascii="Times New Roman" w:hAnsi="Times New Roman" w:cs="Times New Roman" w:eastAsia="Times New Roman"/>
-                <w:sz w:val="20"/>
-                <w:szCs w:val="20"/>
-              </w:rPr>
-              <w:t xml:space="preserve">Trial sequential analysis</w:t>
-            </w:r>
-          </w:p>
-        </w:tc>
-      </w:tr>
-    </w:tbl>
+    <w:p xmlns:a="http://schemas.openxmlformats.org/drawingml/2006/main" xmlns:pic="http://schemas.openxmlformats.org/drawingml/2006/picture">
+      <w:pPr>
+        <w:pStyle w:val="List Bullet"/>
+        <w:spacing w:line="480" w:lineRule="auto" w:after="120"/>
+      </w:pPr>
+      <w:r>
+        <w:rPr>
+          <w:bCs/>
+          <w:b/>
+          <w:rFonts w:ascii="Times New Roman" w:hAnsi="Times New Roman" w:cs="Times New Roman" w:eastAsia="Times New Roman"/>
+          <w:sz w:val="24"/>
+          <w:szCs w:val="24"/>
+        </w:rPr>
+        <w:t xml:space="preserve">ADEMP</w:t>
+      </w:r>
+      <w:r>
+        <w:rPr>
+          <w:rFonts w:ascii="Times New Roman" w:hAnsi="Times New Roman" w:cs="Times New Roman" w:eastAsia="Times New Roman"/>
+          <w:sz w:val="24"/>
+          <w:szCs w:val="24"/>
+        </w:rPr>
+        <w:t xml:space="preserve">: Aims, Data-generating mechanisms, Estimands, Methods, Performance measures</w:t>
+      </w:r>
+    </w:p>
+    <w:p xmlns:a="http://schemas.openxmlformats.org/drawingml/2006/main" xmlns:pic="http://schemas.openxmlformats.org/drawingml/2006/picture">
+      <w:pPr>
+        <w:pStyle w:val="List Bullet"/>
+        <w:spacing w:line="480" w:lineRule="auto" w:after="120"/>
+      </w:pPr>
+      <w:r>
+        <w:rPr>
+          <w:bCs/>
+          <w:b/>
+          <w:rFonts w:ascii="Times New Roman" w:hAnsi="Times New Roman" w:cs="Times New Roman" w:eastAsia="Times New Roman"/>
+          <w:sz w:val="24"/>
+          <w:szCs w:val="24"/>
+        </w:rPr>
+        <w:t xml:space="preserve">AMI</w:t>
+      </w:r>
+      <w:r>
+        <w:rPr>
+          <w:rFonts w:ascii="Times New Roman" w:hAnsi="Times New Roman" w:cs="Times New Roman" w:eastAsia="Times New Roman"/>
+          <w:sz w:val="24"/>
+          <w:szCs w:val="24"/>
+        </w:rPr>
+        <w:t xml:space="preserve">: Acute myocardial infarction</w:t>
+      </w:r>
+    </w:p>
+    <w:p xmlns:a="http://schemas.openxmlformats.org/drawingml/2006/main" xmlns:pic="http://schemas.openxmlformats.org/drawingml/2006/picture">
+      <w:pPr>
+        <w:pStyle w:val="List Bullet"/>
+        <w:spacing w:line="480" w:lineRule="auto" w:after="120"/>
+      </w:pPr>
+      <w:r>
+        <w:rPr>
+          <w:bCs/>
+          <w:b/>
+          <w:rFonts w:ascii="Times New Roman" w:hAnsi="Times New Roman" w:cs="Times New Roman" w:eastAsia="Times New Roman"/>
+          <w:sz w:val="24"/>
+          <w:szCs w:val="24"/>
+        </w:rPr>
+        <w:t xml:space="preserve">CrI</w:t>
+      </w:r>
+      <w:r>
+        <w:rPr>
+          <w:rFonts w:ascii="Times New Roman" w:hAnsi="Times New Roman" w:cs="Times New Roman" w:eastAsia="Times New Roman"/>
+          <w:sz w:val="24"/>
+          <w:szCs w:val="24"/>
+        </w:rPr>
+        <w:t xml:space="preserve">: Credible interval</w:t>
+      </w:r>
+    </w:p>
+    <w:p xmlns:a="http://schemas.openxmlformats.org/drawingml/2006/main" xmlns:pic="http://schemas.openxmlformats.org/drawingml/2006/picture">
+      <w:pPr>
+        <w:pStyle w:val="List Bullet"/>
+        <w:spacing w:line="480" w:lineRule="auto" w:after="120"/>
+      </w:pPr>
+      <w:r>
+        <w:rPr>
+          <w:bCs/>
+          <w:b/>
+          <w:rFonts w:ascii="Times New Roman" w:hAnsi="Times New Roman" w:cs="Times New Roman" w:eastAsia="Times New Roman"/>
+          <w:sz w:val="24"/>
+          <w:szCs w:val="24"/>
+        </w:rPr>
+        <w:t xml:space="preserve">CI</w:t>
+      </w:r>
+      <w:r>
+        <w:rPr>
+          <w:rFonts w:ascii="Times New Roman" w:hAnsi="Times New Roman" w:cs="Times New Roman" w:eastAsia="Times New Roman"/>
+          <w:sz w:val="24"/>
+          <w:szCs w:val="24"/>
+        </w:rPr>
+        <w:t xml:space="preserve">: Confidence interval</w:t>
+      </w:r>
+    </w:p>
+    <w:p xmlns:a="http://schemas.openxmlformats.org/drawingml/2006/main" xmlns:pic="http://schemas.openxmlformats.org/drawingml/2006/picture">
+      <w:pPr>
+        <w:pStyle w:val="List Bullet"/>
+        <w:spacing w:line="480" w:lineRule="auto" w:after="120"/>
+      </w:pPr>
+      <w:r>
+        <w:rPr>
+          <w:bCs/>
+          <w:b/>
+          <w:rFonts w:ascii="Times New Roman" w:hAnsi="Times New Roman" w:cs="Times New Roman" w:eastAsia="Times New Roman"/>
+          <w:sz w:val="24"/>
+          <w:szCs w:val="24"/>
+        </w:rPr>
+        <w:t xml:space="preserve">GRADE</w:t>
+      </w:r>
+      <w:r>
+        <w:rPr>
+          <w:rFonts w:ascii="Times New Roman" w:hAnsi="Times New Roman" w:cs="Times New Roman" w:eastAsia="Times New Roman"/>
+          <w:sz w:val="24"/>
+          <w:szCs w:val="24"/>
+        </w:rPr>
+        <w:t xml:space="preserve">: Grading of Recommendations Assessment, Development and Evaluation</w:t>
+      </w:r>
+    </w:p>
+    <w:p xmlns:a="http://schemas.openxmlformats.org/drawingml/2006/main" xmlns:pic="http://schemas.openxmlformats.org/drawingml/2006/picture">
+      <w:pPr>
+        <w:pStyle w:val="List Bullet"/>
+        <w:spacing w:line="480" w:lineRule="auto" w:after="120"/>
+      </w:pPr>
+      <w:r>
+        <w:rPr>
+          <w:bCs/>
+          <w:b/>
+          <w:rFonts w:ascii="Times New Roman" w:hAnsi="Times New Roman" w:cs="Times New Roman" w:eastAsia="Times New Roman"/>
+          <w:sz w:val="24"/>
+          <w:szCs w:val="24"/>
+        </w:rPr>
+        <w:t xml:space="preserve">HF</w:t>
+      </w:r>
+      <w:r>
+        <w:rPr>
+          <w:rFonts w:ascii="Times New Roman" w:hAnsi="Times New Roman" w:cs="Times New Roman" w:eastAsia="Times New Roman"/>
+          <w:sz w:val="24"/>
+          <w:szCs w:val="24"/>
+        </w:rPr>
+        <w:t xml:space="preserve">: Heart failure</w:t>
+      </w:r>
+    </w:p>
+    <w:p xmlns:a="http://schemas.openxmlformats.org/drawingml/2006/main" xmlns:pic="http://schemas.openxmlformats.org/drawingml/2006/picture">
+      <w:pPr>
+        <w:pStyle w:val="List Bullet"/>
+        <w:spacing w:line="480" w:lineRule="auto" w:after="120"/>
+      </w:pPr>
+      <w:r>
+        <w:rPr>
+          <w:bCs/>
+          <w:b/>
+          <w:rFonts w:ascii="Times New Roman" w:hAnsi="Times New Roman" w:cs="Times New Roman" w:eastAsia="Times New Roman"/>
+          <w:sz w:val="24"/>
+          <w:szCs w:val="24"/>
+        </w:rPr>
+        <w:t xml:space="preserve">HR</w:t>
+      </w:r>
+      <w:r>
+        <w:rPr>
+          <w:rFonts w:ascii="Times New Roman" w:hAnsi="Times New Roman" w:cs="Times New Roman" w:eastAsia="Times New Roman"/>
+          <w:sz w:val="24"/>
+          <w:szCs w:val="24"/>
+        </w:rPr>
+        <w:t xml:space="preserve">: Hazard ratio</w:t>
+      </w:r>
+    </w:p>
+    <w:p xmlns:a="http://schemas.openxmlformats.org/drawingml/2006/main" xmlns:pic="http://schemas.openxmlformats.org/drawingml/2006/picture">
+      <w:pPr>
+        <w:pStyle w:val="List Bullet"/>
+        <w:spacing w:line="480" w:lineRule="auto" w:after="120"/>
+      </w:pPr>
+      <w:r>
+        <w:rPr>
+          <w:bCs/>
+          <w:b/>
+          <w:rFonts w:ascii="Times New Roman" w:hAnsi="Times New Roman" w:cs="Times New Roman" w:eastAsia="Times New Roman"/>
+          <w:sz w:val="24"/>
+          <w:szCs w:val="24"/>
+        </w:rPr>
+        <w:t xml:space="preserve">KOTHA</w:t>
+      </w:r>
+      <w:r>
+        <w:rPr>
+          <w:rFonts w:ascii="Times New Roman" w:hAnsi="Times New Roman" w:cs="Times New Roman" w:eastAsia="Times New Roman"/>
+          <w:sz w:val="24"/>
+          <w:szCs w:val="24"/>
+        </w:rPr>
+        <w:t xml:space="preserve">: Knowledge-driven Observational-Trial Harmonization Approach</w:t>
+      </w:r>
+    </w:p>
+    <w:p xmlns:a="http://schemas.openxmlformats.org/drawingml/2006/main" xmlns:pic="http://schemas.openxmlformats.org/drawingml/2006/picture">
+      <w:pPr>
+        <w:pStyle w:val="List Bullet"/>
+        <w:spacing w:line="480" w:lineRule="auto" w:after="120"/>
+      </w:pPr>
+      <w:r>
+        <w:rPr>
+          <w:bCs/>
+          <w:b/>
+          <w:rFonts w:ascii="Times New Roman" w:hAnsi="Times New Roman" w:cs="Times New Roman" w:eastAsia="Times New Roman"/>
+          <w:sz w:val="24"/>
+          <w:szCs w:val="24"/>
+        </w:rPr>
+        <w:t xml:space="preserve">MCMC</w:t>
+      </w:r>
+      <w:r>
+        <w:rPr>
+          <w:rFonts w:ascii="Times New Roman" w:hAnsi="Times New Roman" w:cs="Times New Roman" w:eastAsia="Times New Roman"/>
+          <w:sz w:val="24"/>
+          <w:szCs w:val="24"/>
+        </w:rPr>
+        <w:t xml:space="preserve">: Markov chain Monte Carlo</w:t>
+      </w:r>
+    </w:p>
+    <w:p xmlns:a="http://schemas.openxmlformats.org/drawingml/2006/main" xmlns:pic="http://schemas.openxmlformats.org/drawingml/2006/picture">
+      <w:pPr>
+        <w:pStyle w:val="List Bullet"/>
+        <w:spacing w:line="480" w:lineRule="auto" w:after="120"/>
+      </w:pPr>
+      <w:r>
+        <w:rPr>
+          <w:bCs/>
+          <w:b/>
+          <w:rFonts w:ascii="Times New Roman" w:hAnsi="Times New Roman" w:cs="Times New Roman" w:eastAsia="Times New Roman"/>
+          <w:sz w:val="24"/>
+          <w:szCs w:val="24"/>
+        </w:rPr>
+        <w:t xml:space="preserve">OIS</w:t>
+      </w:r>
+      <w:r>
+        <w:rPr>
+          <w:rFonts w:ascii="Times New Roman" w:hAnsi="Times New Roman" w:cs="Times New Roman" w:eastAsia="Times New Roman"/>
+          <w:sz w:val="24"/>
+          <w:szCs w:val="24"/>
+        </w:rPr>
+        <w:t xml:space="preserve">: Optimal information size</w:t>
+      </w:r>
+    </w:p>
+    <w:p xmlns:a="http://schemas.openxmlformats.org/drawingml/2006/main" xmlns:pic="http://schemas.openxmlformats.org/drawingml/2006/picture">
+      <w:pPr>
+        <w:pStyle w:val="List Bullet"/>
+        <w:spacing w:line="480" w:lineRule="auto" w:after="120"/>
+      </w:pPr>
+      <w:r>
+        <w:rPr>
+          <w:bCs/>
+          <w:b/>
+          <w:rFonts w:ascii="Times New Roman" w:hAnsi="Times New Roman" w:cs="Times New Roman" w:eastAsia="Times New Roman"/>
+          <w:sz w:val="24"/>
+          <w:szCs w:val="24"/>
+        </w:rPr>
+        <w:t xml:space="preserve">OR</w:t>
+      </w:r>
+      <w:r>
+        <w:rPr>
+          <w:rFonts w:ascii="Times New Roman" w:hAnsi="Times New Roman" w:cs="Times New Roman" w:eastAsia="Times New Roman"/>
+          <w:sz w:val="24"/>
+          <w:szCs w:val="24"/>
+        </w:rPr>
+        <w:t xml:space="preserve">: Odds ratio</w:t>
+      </w:r>
+    </w:p>
+    <w:p xmlns:a="http://schemas.openxmlformats.org/drawingml/2006/main" xmlns:pic="http://schemas.openxmlformats.org/drawingml/2006/picture">
+      <w:pPr>
+        <w:pStyle w:val="List Bullet"/>
+        <w:spacing w:line="480" w:lineRule="auto" w:after="120"/>
+      </w:pPr>
+      <w:r>
+        <w:rPr>
+          <w:bCs/>
+          <w:b/>
+          <w:rFonts w:ascii="Times New Roman" w:hAnsi="Times New Roman" w:cs="Times New Roman" w:eastAsia="Times New Roman"/>
+          <w:sz w:val="24"/>
+          <w:szCs w:val="24"/>
+        </w:rPr>
+        <w:t xml:space="preserve">RCT</w:t>
+      </w:r>
+      <w:r>
+        <w:rPr>
+          <w:rFonts w:ascii="Times New Roman" w:hAnsi="Times New Roman" w:cs="Times New Roman" w:eastAsia="Times New Roman"/>
+          <w:sz w:val="24"/>
+          <w:szCs w:val="24"/>
+        </w:rPr>
+        <w:t xml:space="preserve">: Randomized controlled trial</w:t>
+      </w:r>
+    </w:p>
+    <w:p xmlns:a="http://schemas.openxmlformats.org/drawingml/2006/main" xmlns:pic="http://schemas.openxmlformats.org/drawingml/2006/picture">
+      <w:pPr>
+        <w:pStyle w:val="List Bullet"/>
+        <w:spacing w:line="480" w:lineRule="auto" w:after="120"/>
+      </w:pPr>
+      <w:r>
+        <w:rPr>
+          <w:bCs/>
+          <w:b/>
+          <w:rFonts w:ascii="Times New Roman" w:hAnsi="Times New Roman" w:cs="Times New Roman" w:eastAsia="Times New Roman"/>
+          <w:sz w:val="24"/>
+          <w:szCs w:val="24"/>
+        </w:rPr>
+        <w:t xml:space="preserve">TSA</w:t>
+      </w:r>
+      <w:r>
+        <w:rPr>
+          <w:rFonts w:ascii="Times New Roman" w:hAnsi="Times New Roman" w:cs="Times New Roman" w:eastAsia="Times New Roman"/>
+          <w:sz w:val="24"/>
+          <w:szCs w:val="24"/>
+        </w:rPr>
+        <w:t xml:space="preserve">: Trial sequential analysis</w:t>
+      </w:r>
+    </w:p>
     <w:p>
       <w:pPr>
         <w:pStyle w:val="Heading2"/>
@@ -1254,6 +1016,65 @@
           <w:szCs w:val="24"/>
         </w:rPr>
         <w:t xml:space="preserve">The KOTHA Framework comprises three interconnected modules (Fig. 1). Module K (Counterfactual Power Simulation) quantifies how enrollment-driven risk-profile shifts reduce statistical power. Module T (Trial-Observational Bayesian Integration) combines RCT and observational evidence with explicit discounting for design-related bias. Module H (Guideline Interpreter) translates module outputs into a structured GRADE assessment. Each module can be used independently, but the framework is most informative when applied in sequence.</w:t>
+      </w:r>
+    </w:p>
+    <w:p>
+      <w:pPr>
+        <w:jc w:val="center"/>
+      </w:pPr>
+      <w:r>
+        <w:drawing>
+          <wp:inline xmlns:a="http://schemas.openxmlformats.org/drawingml/2006/main" xmlns:pic="http://schemas.openxmlformats.org/drawingml/2006/picture">
+            <wp:extent cx="5029200" cy="3537145"/>
+            <wp:docPr id="1" name="Picture 1"/>
+            <wp:cNvGraphicFramePr>
+              <a:graphicFrameLocks noChangeAspect="1"/>
+            </wp:cNvGraphicFramePr>
+            <a:graphic>
+              <a:graphicData uri="http://schemas.openxmlformats.org/drawingml/2006/picture">
+                <pic:pic>
+                  <pic:nvPicPr>
+                    <pic:cNvPr id="0" name="fig1_framework_overview.png"/>
+                    <pic:cNvPicPr/>
+                  </pic:nvPicPr>
+                  <pic:blipFill>
+                    <a:blip r:embed="rId10"/>
+                    <a:stretch>
+                      <a:fillRect/>
+                    </a:stretch>
+                  </pic:blipFill>
+                  <pic:spPr>
+                    <a:xfrm>
+                      <a:off x="0" y="0"/>
+                      <a:ext cx="5029200" cy="3537145"/>
+                    </a:xfrm>
+                    <a:prstGeom prst="rect"/>
+                  </pic:spPr>
+                </pic:pic>
+              </a:graphicData>
+            </a:graphic>
+          </wp:inline>
+        </w:drawing>
+      </w:r>
+    </w:p>
+    <w:p>
+      <w:pPr>
+        <w:jc w:val="left"/>
+      </w:pPr>
+      <w:r>
+        <w:rPr>
+          <w:rFonts w:ascii="Times New Roman" w:hAnsi="Times New Roman"/>
+          <w:b/>
+          <w:sz w:val="20"/>
+        </w:rPr>
+        <w:t xml:space="preserve">Figure 1. </w:t>
+      </w:r>
+      <w:r>
+        <w:rPr>
+          <w:rFonts w:ascii="Times New Roman" w:hAnsi="Times New Roman"/>
+          <w:sz w:val="20"/>
+        </w:rPr>
+        <w:t>Overview of the KOTHA Framework. Module K (Counterfactual Power Simulation) quantifies risk-profile shift and estimates power under counterfactual enrollment scenarios. Module T (Bayesian Evidence Integration) combines RCT and observational evidence using power-prior discounting. Module H (Guideline Interpreter) synthesizes outputs into a structured GRADE-compatible assessment.</w:t>
       </w:r>
     </w:p>
     <w:p>
@@ -2750,65 +2571,6 @@
           <w:szCs w:val="24"/>
         </w:rPr>
         <w:t xml:space="preserve">. All analyses were performed with the Python code in the public repository.</w:t>
-      </w:r>
-    </w:p>
-    <w:p>
-      <w:pPr>
-        <w:jc w:val="center"/>
-      </w:pPr>
-      <w:r>
-        <w:drawing>
-          <wp:inline xmlns:a="http://schemas.openxmlformats.org/drawingml/2006/main" xmlns:pic="http://schemas.openxmlformats.org/drawingml/2006/picture">
-            <wp:extent cx="5029200" cy="3537145"/>
-            <wp:docPr id="1" name="Picture 1"/>
-            <wp:cNvGraphicFramePr>
-              <a:graphicFrameLocks noChangeAspect="1"/>
-            </wp:cNvGraphicFramePr>
-            <a:graphic>
-              <a:graphicData uri="http://schemas.openxmlformats.org/drawingml/2006/picture">
-                <pic:pic>
-                  <pic:nvPicPr>
-                    <pic:cNvPr id="0" name="fig1_framework_overview.png"/>
-                    <pic:cNvPicPr/>
-                  </pic:nvPicPr>
-                  <pic:blipFill>
-                    <a:blip r:embed="rId10"/>
-                    <a:stretch>
-                      <a:fillRect/>
-                    </a:stretch>
-                  </pic:blipFill>
-                  <pic:spPr>
-                    <a:xfrm>
-                      <a:off x="0" y="0"/>
-                      <a:ext cx="5029200" cy="3537145"/>
-                    </a:xfrm>
-                    <a:prstGeom prst="rect"/>
-                  </pic:spPr>
-                </pic:pic>
-              </a:graphicData>
-            </a:graphic>
-          </wp:inline>
-        </w:drawing>
-      </w:r>
-    </w:p>
-    <w:p>
-      <w:pPr>
-        <w:jc w:val="left"/>
-      </w:pPr>
-      <w:r>
-        <w:rPr>
-          <w:rFonts w:ascii="Times New Roman" w:hAnsi="Times New Roman"/>
-          <w:b/>
-          <w:sz w:val="20"/>
-        </w:rPr>
-        <w:t xml:space="preserve">Figure 1. </w:t>
-      </w:r>
-      <w:r>
-        <w:rPr>
-          <w:rFonts w:ascii="Times New Roman" w:hAnsi="Times New Roman"/>
-          <w:sz w:val="20"/>
-        </w:rPr>
-        <w:t>Overview of the KOTHA Framework. Module K (Counterfactual Power Simulation) quantifies risk-profile shift and estimates power under counterfactual enrollment scenarios. Module T (Bayesian Evidence Integration) combines RCT and observational evidence using power-prior discounting. Module H (Guideline Interpreter) synthesizes outputs into a structured GRADE-compatible assessment.</w:t>
       </w:r>
     </w:p>
     <w:p>

</xml_diff>

<commit_message>
Finalize Clinical Trials deliverables with simulation, add revised critical review, update public sync mapping
Co-Authored-By: Tatsuki Onishi <bougtoir@gmail.com>
</commit_message>
<xml_diff>
--- a/rct-decomposition/KOTHA_Framework_ClinicalTrials.docx
+++ b/rct-decomposition/KOTHA_Framework_ClinicalTrials.docx
@@ -13,7 +13,7 @@
           <w:i w:val="0"/>
           <w:sz w:val="24"/>
         </w:rPr>
-        <w:t>Running head: KOTHA Framework for Trial Design</w:t>
+        <w:t>Running head: KOTHA Framework for Information Loss</w:t>
       </w:r>
     </w:p>
     <w:p>
@@ -27,7 +27,7 @@
           <w:i w:val="0"/>
           <w:sz w:val="28"/>
         </w:rPr>
-        <w:t>The KOTHA Framework: Diagnosing Structural Information Loss in Randomized Controlled Trial Meta-Analyses to Inform Trial Design</w:t>
+        <w:t>The KOTHA Framework: A Simulation-Based Approach to Quantifying and Correcting Structural Information Loss in Randomized Controlled Trial Meta-Analyses</w:t>
       </w:r>
     </w:p>
     <w:p>
@@ -88,7 +88,7 @@
           <w:i w:val="0"/>
           <w:sz w:val="24"/>
         </w:rPr>
-        <w:t>Word count: 2682</w:t>
+        <w:t>Word count: 3100</w:t>
       </w:r>
     </w:p>
     <w:p>
@@ -2404,7 +2404,622 @@
           <w:sz w:val="24"/>
           <w:szCs w:val="24"/>
         </w:rPr>
-        <w:t xml:space="preserve">. It includes five assessments (Table 1): information sufficiency (OIS vs observed events), confidence interval interpretation, representativeness (event rate ratio), TSA boundary status, and recommended language. For CI interpretation, we used relative effect boundaries of 0.80 and 1.25 to define clinically important benefit and harm. For representativeness, event-rate ratios below 0.67 or above 1.50 (a relative shift of 50% or more) are classified as serious indirectness, and ratios below 0.80 or above 1.25 (a relative shift of 25% or more) as moderate indirectness. These thresholds correspond to conventional boundaries for clinically important relative effects. The result is a KOTHA-enhanced certainty rating and recommendation that explicitly distinguishes "evidence of effect," "evidence of no effect," and "no evidence of effect (inconsistent or indirect).</w:t>
+        <w:t xml:space="preserve">. It includes five assessments (Table 1): information sufficiency (OIS vs observed events), confidence interval interpretation, representativeness (event rate ratio), TSA boundary status, and recommended language. For CI interpretation, we used relative effect boundaries of 0.80 and 1.25 to define clinically important benefit and harm. For representativeness, event-rate ratios below 0.67 or above 1.50 (a relative shift of 50% or more) are classified as serious indirectness, and ratios below 0.80 or above 1.25 (a relative shift of 25% or more) as moderate indirectness. These thresholds correspond to conventional boundaries for clinically important relative effects. The result is a KOTHA-enhanced certainty rating and recommendation that explicitly distinguishes "evidence of effect," "evidence of no effect," and "no evidence of effect (inconsistent or indirect)."</w:t>
+      </w:r>
+    </w:p>
+    <w:p>
+      <w:pPr>
+        <w:pStyle w:val="Heading3"/>
+      </w:pPr>
+      <w:r>
+        <w:rPr>
+          <w:rFonts w:ascii="Times New Roman" w:hAnsi="Times New Roman"/>
+          <w:b/>
+          <w:color w:val="000000"/>
+          <w:sz w:val="24"/>
+        </w:rPr>
+        <w:t>Formal causal model and operating-characteristics simulation</w:t>
+      </w:r>
+    </w:p>
+    <w:p xmlns:a="http://schemas.openxmlformats.org/drawingml/2006/main" xmlns:pic="http://schemas.openxmlformats.org/drawingml/2006/picture">
+      <w:pPr>
+        <w:pStyle w:val="Normal"/>
+        <w:spacing w:line="480" w:lineRule="auto" w:after="120"/>
+      </w:pPr>
+      <w:r>
+        <w:rPr>
+          <w:rFonts w:ascii="Times New Roman" w:hAnsi="Times New Roman" w:cs="Times New Roman" w:eastAsia="Times New Roman"/>
+          <w:sz w:val="24"/>
+          <w:szCs w:val="24"/>
+        </w:rPr>
+        <w:t xml:space="preserve">To quantify the operating characteristics of the KOTHA evidence combination rule, we specified a transparent data-generating process that mimics the two empirical cases. Let</w:t>
+      </w:r>
+      <w:r>
+        <w:rPr>
+          <w:rFonts w:ascii="Times New Roman" w:hAnsi="Times New Roman" w:cs="Times New Roman" w:eastAsia="Times New Roman"/>
+          <w:sz w:val="24"/>
+          <w:szCs w:val="24"/>
+        </w:rPr>
+        <w:t xml:space="preserve"> </w:t>
+      </w:r>
+      <m:oMath>
+        <m:sSub>
+          <m:e>
+            <m:r>
+              <m:t>Z</m:t>
+            </m:r>
+          </m:e>
+          <m:sub>
+            <m:r>
+              <m:t>i</m:t>
+            </m:r>
+          </m:sub>
+        </m:sSub>
+        <m:r>
+          <m:rPr>
+            <m:sty m:val="p"/>
+          </m:rPr>
+          <m:t>∼</m:t>
+        </m:r>
+        <m:r>
+          <m:rPr>
+            <m:nor/>
+            <m:sty m:val="p"/>
+          </m:rPr>
+          <m:t>Logit-Normal</m:t>
+        </m:r>
+        <m:d>
+          <m:dPr>
+            <m:begChr m:val="("/>
+            <m:endChr m:val=")"/>
+            <m:sepChr m:val=""/>
+            <m:grow/>
+          </m:dPr>
+          <m:e>
+            <m:sSub>
+              <m:e>
+                <m:r>
+                  <m:t>μ</m:t>
+                </m:r>
+              </m:e>
+              <m:sub>
+                <m:r>
+                  <m:t>Z</m:t>
+                </m:r>
+              </m:sub>
+            </m:sSub>
+            <m:r>
+              <m:rPr>
+                <m:sty m:val="p"/>
+              </m:rPr>
+              <m:t>,</m:t>
+            </m:r>
+            <m:sSubSup>
+              <m:e>
+                <m:r>
+                  <m:t>σ</m:t>
+                </m:r>
+              </m:e>
+              <m:sub>
+                <m:r>
+                  <m:t>Z</m:t>
+                </m:r>
+              </m:sub>
+              <m:sup>
+                <m:r>
+                  <m:t>2</m:t>
+                </m:r>
+              </m:sup>
+            </m:sSubSup>
+          </m:e>
+        </m:d>
+      </m:oMath>
+      <w:r>
+        <w:rPr>
+          <w:rFonts w:ascii="Times New Roman" w:hAnsi="Times New Roman" w:cs="Times New Roman" w:eastAsia="Times New Roman"/>
+          <w:sz w:val="24"/>
+          <w:szCs w:val="24"/>
+        </w:rPr>
+        <w:t xml:space="preserve"> </w:t>
+      </w:r>
+      <w:r>
+        <w:rPr>
+          <w:rFonts w:ascii="Times New Roman" w:hAnsi="Times New Roman" w:cs="Times New Roman" w:eastAsia="Times New Roman"/>
+          <w:sz w:val="24"/>
+          <w:szCs w:val="24"/>
+        </w:rPr>
+        <w:t xml:space="preserve">denote the baseline risk of trial</w:t>
+      </w:r>
+      <w:r>
+        <w:rPr>
+          <w:rFonts w:ascii="Times New Roman" w:hAnsi="Times New Roman" w:cs="Times New Roman" w:eastAsia="Times New Roman"/>
+          <w:sz w:val="24"/>
+          <w:szCs w:val="24"/>
+        </w:rPr>
+        <w:t xml:space="preserve"> </w:t>
+      </w:r>
+      <m:oMath>
+        <m:r>
+          <m:t>i</m:t>
+        </m:r>
+      </m:oMath>
+      <w:r>
+        <w:rPr>
+          <w:rFonts w:ascii="Times New Roman" w:hAnsi="Times New Roman" w:cs="Times New Roman" w:eastAsia="Times New Roman"/>
+          <w:sz w:val="24"/>
+          <w:szCs w:val="24"/>
+        </w:rPr>
+        <w:t xml:space="preserve"> </w:t>
+      </w:r>
+      <w:r>
+        <w:rPr>
+          <w:rFonts w:ascii="Times New Roman" w:hAnsi="Times New Roman" w:cs="Times New Roman" w:eastAsia="Times New Roman"/>
+          <w:sz w:val="24"/>
+          <w:szCs w:val="24"/>
+        </w:rPr>
+        <w:t xml:space="preserve">on the log-odds scale. The true treatment effect in that population is</w:t>
+      </w:r>
+      <w:r>
+        <w:rPr>
+          <w:rFonts w:ascii="Times New Roman" w:hAnsi="Times New Roman" w:cs="Times New Roman" w:eastAsia="Times New Roman"/>
+          <w:sz w:val="24"/>
+          <w:szCs w:val="24"/>
+        </w:rPr>
+        <w:t xml:space="preserve"> </w:t>
+      </w:r>
+      <m:oMath>
+        <m:sSub>
+          <m:e>
+            <m:r>
+              <m:rPr>
+                <m:nor/>
+                <m:sty m:val="p"/>
+              </m:rPr>
+              <m:t>log OR</m:t>
+            </m:r>
+          </m:e>
+          <m:sub>
+            <m:r>
+              <m:t>i</m:t>
+            </m:r>
+          </m:sub>
+        </m:sSub>
+        <m:r>
+          <m:rPr>
+            <m:sty m:val="p"/>
+          </m:rPr>
+          <m:t>=</m:t>
+        </m:r>
+        <m:sSub>
+          <m:e>
+            <m:r>
+              <m:t>θ</m:t>
+            </m:r>
+          </m:e>
+          <m:sub>
+            <m:r>
+              <m:t>0</m:t>
+            </m:r>
+          </m:sub>
+        </m:sSub>
+        <m:r>
+          <m:rPr>
+            <m:sty m:val="p"/>
+          </m:rPr>
+          <m:t>+</m:t>
+        </m:r>
+        <m:r>
+          <m:t>γ</m:t>
+        </m:r>
+        <m:sSub>
+          <m:e>
+            <m:r>
+              <m:t>Z</m:t>
+            </m:r>
+          </m:e>
+          <m:sub>
+            <m:r>
+              <m:t>i</m:t>
+            </m:r>
+          </m:sub>
+        </m:sSub>
+      </m:oMath>
+      <w:r>
+        <w:rPr>
+          <w:rFonts w:ascii="Times New Roman" w:hAnsi="Times New Roman" w:cs="Times New Roman" w:eastAsia="Times New Roman"/>
+          <w:sz w:val="24"/>
+          <w:szCs w:val="24"/>
+        </w:rPr>
+        <w:t xml:space="preserve">, with</w:t>
+      </w:r>
+      <w:r>
+        <w:rPr>
+          <w:rFonts w:ascii="Times New Roman" w:hAnsi="Times New Roman" w:cs="Times New Roman" w:eastAsia="Times New Roman"/>
+          <w:sz w:val="24"/>
+          <w:szCs w:val="24"/>
+        </w:rPr>
+        <w:t xml:space="preserve"> </w:t>
+      </w:r>
+      <m:oMath>
+        <m:r>
+          <m:t>γ</m:t>
+        </m:r>
+        <m:r>
+          <m:rPr>
+            <m:sty m:val="p"/>
+          </m:rPr>
+          <m:t>&lt;</m:t>
+        </m:r>
+        <m:r>
+          <m:t>0</m:t>
+        </m:r>
+      </m:oMath>
+      <w:r>
+        <w:rPr>
+          <w:rFonts w:ascii="Times New Roman" w:hAnsi="Times New Roman" w:cs="Times New Roman" w:eastAsia="Times New Roman"/>
+          <w:sz w:val="24"/>
+          <w:szCs w:val="24"/>
+        </w:rPr>
+        <w:t xml:space="preserve"> </w:t>
+      </w:r>
+      <w:r>
+        <w:rPr>
+          <w:rFonts w:ascii="Times New Roman" w:hAnsi="Times New Roman" w:cs="Times New Roman" w:eastAsia="Times New Roman"/>
+          <w:sz w:val="24"/>
+          <w:szCs w:val="24"/>
+        </w:rPr>
+        <w:t xml:space="preserve">meaning that baseline risk modifies the treatment effect (higher-risk patients experience larger absolute or relative benefit). The target population is all hypothetical RCTs; the enrolled population is a lower-risk subset selected by a quantile threshold on</w:t>
+      </w:r>
+      <w:r>
+        <w:rPr>
+          <w:rFonts w:ascii="Times New Roman" w:hAnsi="Times New Roman" w:cs="Times New Roman" w:eastAsia="Times New Roman"/>
+          <w:sz w:val="24"/>
+          <w:szCs w:val="24"/>
+        </w:rPr>
+        <w:t xml:space="preserve"> </w:t>
+      </w:r>
+      <m:oMath>
+        <m:sSub>
+          <m:e>
+            <m:r>
+              <m:t>Z</m:t>
+            </m:r>
+          </m:e>
+          <m:sub>
+            <m:r>
+              <m:t>i</m:t>
+            </m:r>
+          </m:sub>
+        </m:sSub>
+      </m:oMath>
+      <w:r>
+        <w:rPr>
+          <w:rFonts w:ascii="Times New Roman" w:hAnsi="Times New Roman" w:cs="Times New Roman" w:eastAsia="Times New Roman"/>
+          <w:sz w:val="24"/>
+          <w:szCs w:val="24"/>
+        </w:rPr>
+        <w:t xml:space="preserve">. This is the formal mechanism for structural information loss: the RCT-enrolled meta-analysis estimates the treatment effect in a selected, lower-risk subpopulation rather than the target estimand</w:t>
+      </w:r>
+      <w:r>
+        <w:rPr>
+          <w:rFonts w:ascii="Times New Roman" w:hAnsi="Times New Roman" w:cs="Times New Roman" w:eastAsia="Times New Roman"/>
+          <w:sz w:val="24"/>
+          <w:szCs w:val="24"/>
+        </w:rPr>
+        <w:t xml:space="preserve"> </w:t>
+      </w:r>
+      <m:oMath>
+        <m:r>
+          <m:rPr>
+            <m:sty m:val="p"/>
+            <m:scr m:val="double-struck"/>
+          </m:rPr>
+          <m:t>E</m:t>
+        </m:r>
+        <m:d>
+          <m:dPr>
+            <m:begChr m:val="["/>
+            <m:endChr m:val="]"/>
+            <m:sepChr m:val=""/>
+            <m:grow/>
+          </m:dPr>
+          <m:e>
+            <m:r>
+              <m:rPr>
+                <m:nor/>
+                <m:sty m:val="p"/>
+              </m:rPr>
+              <m:t>log OR</m:t>
+            </m:r>
+          </m:e>
+        </m:d>
+      </m:oMath>
+      <w:r>
+        <w:rPr>
+          <w:rFonts w:ascii="Times New Roman" w:hAnsi="Times New Roman" w:cs="Times New Roman" w:eastAsia="Times New Roman"/>
+          <w:sz w:val="24"/>
+          <w:szCs w:val="24"/>
+        </w:rPr>
+        <w:t xml:space="preserve"> </w:t>
+      </w:r>
+      <w:r>
+        <w:rPr>
+          <w:rFonts w:ascii="Times New Roman" w:hAnsi="Times New Roman" w:cs="Times New Roman" w:eastAsia="Times New Roman"/>
+          <w:sz w:val="24"/>
+          <w:szCs w:val="24"/>
+        </w:rPr>
+        <w:t xml:space="preserve">over all RCTs.</w:t>
+      </w:r>
+    </w:p>
+    <w:p xmlns:a="http://schemas.openxmlformats.org/drawingml/2006/main" xmlns:pic="http://schemas.openxmlformats.org/drawingml/2006/picture">
+      <w:pPr>
+        <w:pStyle w:val="Normal"/>
+        <w:spacing w:line="480" w:lineRule="auto" w:after="120"/>
+      </w:pPr>
+      <w:r>
+        <w:rPr>
+          <w:rFonts w:ascii="Times New Roman" w:hAnsi="Times New Roman" w:cs="Times New Roman" w:eastAsia="Times New Roman"/>
+          <w:sz w:val="24"/>
+          <w:szCs w:val="24"/>
+        </w:rPr>
+        <w:t xml:space="preserve">An observational source is generated from the same target population but with systematic design-related bias toward spurious benefit,</w:t>
+      </w:r>
+      <w:r>
+        <w:rPr>
+          <w:rFonts w:ascii="Times New Roman" w:hAnsi="Times New Roman" w:cs="Times New Roman" w:eastAsia="Times New Roman"/>
+          <w:sz w:val="24"/>
+          <w:szCs w:val="24"/>
+        </w:rPr>
+        <w:t xml:space="preserve"> </w:t>
+      </w:r>
+      <m:oMath>
+        <m:r>
+          <m:rPr>
+            <m:nor/>
+            <m:sty m:val="p"/>
+          </m:rPr>
+          <m:t>E</m:t>
+        </m:r>
+        <m:d>
+          <m:dPr>
+            <m:begChr m:val="["/>
+            <m:endChr m:val="]"/>
+            <m:sepChr m:val=""/>
+            <m:grow/>
+          </m:dPr>
+          <m:e>
+            <m:sSub>
+              <m:e>
+                <m:acc>
+                  <m:accPr>
+                    <m:chr m:val="̂"/>
+                  </m:accPr>
+                  <m:e>
+                    <m:r>
+                      <m:t>θ</m:t>
+                    </m:r>
+                  </m:e>
+                </m:acc>
+              </m:e>
+              <m:sub>
+                <m:r>
+                  <m:rPr>
+                    <m:nor/>
+                    <m:sty m:val="p"/>
+                  </m:rPr>
+                  <m:t>obs</m:t>
+                </m:r>
+              </m:sub>
+            </m:sSub>
+          </m:e>
+        </m:d>
+        <m:r>
+          <m:rPr>
+            <m:sty m:val="p"/>
+          </m:rPr>
+          <m:t>=</m:t>
+        </m:r>
+        <m:sSub>
+          <m:e>
+            <m:r>
+              <m:t>θ</m:t>
+            </m:r>
+          </m:e>
+          <m:sub>
+            <m:r>
+              <m:rPr>
+                <m:nor/>
+                <m:sty m:val="p"/>
+              </m:rPr>
+              <m:t>true</m:t>
+            </m:r>
+          </m:sub>
+        </m:sSub>
+        <m:r>
+          <m:rPr>
+            <m:sty m:val="p"/>
+          </m:rPr>
+          <m:t>+</m:t>
+        </m:r>
+        <m:sSub>
+          <m:e>
+            <m:r>
+              <m:t>β</m:t>
+            </m:r>
+          </m:e>
+          <m:sub>
+            <m:r>
+              <m:rPr>
+                <m:nor/>
+                <m:sty m:val="p"/>
+              </m:rPr>
+              <m:t>obs</m:t>
+            </m:r>
+          </m:sub>
+        </m:sSub>
+      </m:oMath>
+      <w:r>
+        <w:rPr>
+          <w:rFonts w:ascii="Times New Roman" w:hAnsi="Times New Roman" w:cs="Times New Roman" w:eastAsia="Times New Roman"/>
+          <w:sz w:val="24"/>
+          <w:szCs w:val="24"/>
+        </w:rPr>
+        <w:t xml:space="preserve"> </w:t>
+      </w:r>
+      <w:r>
+        <w:rPr>
+          <w:rFonts w:ascii="Times New Roman" w:hAnsi="Times New Roman" w:cs="Times New Roman" w:eastAsia="Times New Roman"/>
+          <w:sz w:val="24"/>
+          <w:szCs w:val="24"/>
+        </w:rPr>
+        <w:t xml:space="preserve">with inflated standard errors. The KOTHA combination uses a normal-approximation power-prior,</w:t>
+      </w:r>
+      <w:r>
+        <w:rPr>
+          <w:rFonts w:ascii="Times New Roman" w:hAnsi="Times New Roman" w:cs="Times New Roman" w:eastAsia="Times New Roman"/>
+          <w:sz w:val="24"/>
+          <w:szCs w:val="24"/>
+        </w:rPr>
+        <w:t xml:space="preserve"> </w:t>
+      </w:r>
+      <m:oMath>
+        <m:r>
+          <m:rPr>
+            <m:nor/>
+            <m:sty m:val="p"/>
+          </m:rPr>
+          <m:t>log-posterior</m:t>
+        </m:r>
+        <m:r>
+          <m:rPr>
+            <m:sty m:val="p"/>
+          </m:rPr>
+          <m:t>∝</m:t>
+        </m:r>
+        <m:r>
+          <m:t>α</m:t>
+        </m:r>
+        <m:r>
+          <m:rPr>
+            <m:sty m:val="p"/>
+          </m:rPr>
+          <m:t>⋅</m:t>
+        </m:r>
+        <m:sSub>
+          <m:e>
+            <m:r>
+              <m:rPr>
+                <m:nor/>
+                <m:sty m:val="p"/>
+              </m:rPr>
+              <m:t>log-likelihood</m:t>
+            </m:r>
+          </m:e>
+          <m:sub>
+            <m:r>
+              <m:rPr>
+                <m:nor/>
+                <m:sty m:val="p"/>
+              </m:rPr>
+              <m:t>obs</m:t>
+            </m:r>
+          </m:sub>
+        </m:sSub>
+        <m:r>
+          <m:rPr>
+            <m:sty m:val="p"/>
+          </m:rPr>
+          <m:t>+</m:t>
+        </m:r>
+        <m:sSub>
+          <m:e>
+            <m:r>
+              <m:rPr>
+                <m:nor/>
+                <m:sty m:val="p"/>
+              </m:rPr>
+              <m:t>log-likelihood</m:t>
+            </m:r>
+          </m:e>
+          <m:sub>
+            <m:r>
+              <m:rPr>
+                <m:nor/>
+                <m:sty m:val="p"/>
+              </m:rPr>
+              <m:t>rct</m:t>
+            </m:r>
+          </m:sub>
+        </m:sSub>
+        <m:r>
+          <m:rPr>
+            <m:sty m:val="p"/>
+          </m:rPr>
+          <m:t>+</m:t>
+        </m:r>
+        <m:r>
+          <m:rPr>
+            <m:nor/>
+            <m:sty m:val="p"/>
+          </m:rPr>
+          <m:t>log-prior</m:t>
+        </m:r>
+        <m:d>
+          <m:dPr>
+            <m:begChr m:val="("/>
+            <m:endChr m:val=")"/>
+            <m:sepChr m:val=""/>
+            <m:grow/>
+          </m:dPr>
+          <m:e>
+            <m:r>
+              <m:t>θ</m:t>
+            </m:r>
+            <m:r>
+              <m:rPr>
+                <m:sty m:val="p"/>
+              </m:rPr>
+              <m:t>,</m:t>
+            </m:r>
+            <m:sSup>
+              <m:e>
+                <m:r>
+                  <m:t>τ</m:t>
+                </m:r>
+              </m:e>
+              <m:sup>
+                <m:r>
+                  <m:t>2</m:t>
+                </m:r>
+              </m:sup>
+            </m:sSup>
+          </m:e>
+        </m:d>
+      </m:oMath>
+      <w:r>
+        <w:rPr>
+          <w:rFonts w:ascii="Times New Roman" w:hAnsi="Times New Roman" w:cs="Times New Roman" w:eastAsia="Times New Roman"/>
+          <w:sz w:val="24"/>
+          <w:szCs w:val="24"/>
+        </w:rPr>
+        <w:t xml:space="preserve">, and returns the posterior mean as the point estimate. Performance was evaluated by bias, RMSE, 95% credible-interval coverage, and statistical power (posterior probability that OR &lt; 1 exceeds 97.5%) relative to the target estimand. The simulation was run with 500 replications under pre-specified parameters; results are reported using the ADEMP checklist </w:t>
+      </w:r>
+      <w:r>
+        <w:rPr>
+          <w:rFonts w:ascii="Times New Roman" w:hAnsi="Times New Roman" w:cs="Times New Roman" w:eastAsia="Times New Roman"/>
+          <w:sz w:val="24"/>
+          <w:szCs w:val="24"/>
+          <w:vertAlign w:val="superscript"/>
+        </w:rPr>
+        <w:t xml:space="preserve">10</w:t>
+      </w:r>
+      <w:r>
+        <w:rPr>
+          <w:rFonts w:ascii="Times New Roman" w:hAnsi="Times New Roman" w:cs="Times New Roman" w:eastAsia="Times New Roman"/>
+          <w:sz w:val="24"/>
+          <w:szCs w:val="24"/>
+        </w:rPr>
+        <w:t xml:space="preserve">.</w:t>
       </w:r>
     </w:p>
     <w:p>
@@ -4697,6 +5312,49 @@
         <w:t xml:space="preserve">= 62%) than with underpowering alone. In the statins case, Module K showed that RCT populations had roughly half the event rate of observational cohorts, and that power for a modest effect (HR = 0.85) dropped from 98% to 83%. Module T showed that even modest borrowing from observational evidence materially raised the posterior probability of benefit, yet the evidence remained uncertain. Module H classified magnesium as inconclusive with serious inconsistency (heterogeneity), and statins as inconclusive with serious indirectness, rather than "evidence of no effect."</w:t>
       </w:r>
     </w:p>
+    <w:p xmlns:a="http://schemas.openxmlformats.org/drawingml/2006/main" xmlns:pic="http://schemas.openxmlformats.org/drawingml/2006/picture">
+      <w:pPr>
+        <w:pStyle w:val="Normal"/>
+        <w:spacing w:line="480" w:lineRule="auto" w:after="120"/>
+      </w:pPr>
+      <w:r>
+        <w:rPr>
+          <w:rFonts w:ascii="Times New Roman" w:hAnsi="Times New Roman" w:cs="Times New Roman" w:eastAsia="Times New Roman"/>
+          <w:sz w:val="24"/>
+          <w:szCs w:val="24"/>
+        </w:rPr>
+        <w:t xml:space="preserve">The simulation study formalizes the mechanism behind these empirical patterns. Under a transparent generative model with risk-dependent treatment effects and selective low-risk enrollment, the RCT-enrolled-only meta-analysis was biased toward the null and underpowered, while the observational-only estimate was biased toward spurious benefit. KOTHA with a fixed discount of</w:t>
+      </w:r>
+      <w:r>
+        <w:rPr>
+          <w:rFonts w:ascii="Times New Roman" w:hAnsi="Times New Roman" w:cs="Times New Roman" w:eastAsia="Times New Roman"/>
+          <w:sz w:val="24"/>
+          <w:szCs w:val="24"/>
+        </w:rPr>
+        <w:t xml:space="preserve"> </w:t>
+      </w:r>
+      <m:oMath>
+        <m:r>
+          <m:t>α</m:t>
+        </m:r>
+      </m:oMath>
+      <w:r>
+        <w:rPr>
+          <w:rFonts w:ascii="Times New Roman" w:hAnsi="Times New Roman" w:cs="Times New Roman" w:eastAsia="Times New Roman"/>
+          <w:sz w:val="24"/>
+          <w:szCs w:val="24"/>
+        </w:rPr>
+        <w:t xml:space="preserve"> </w:t>
+      </w:r>
+      <w:r>
+        <w:rPr>
+          <w:rFonts w:ascii="Times New Roman" w:hAnsi="Times New Roman" w:cs="Times New Roman" w:eastAsia="Times New Roman"/>
+          <w:sz w:val="24"/>
+          <w:szCs w:val="24"/>
+        </w:rPr>
+        <w:t xml:space="preserve">= 0.3 reduced RMSE by 37% and increased power by 63 percentage points compared with RCT-enrolled-only analysis. These gains show that the power-prior combination rule can improve operating characteristics when observational data contain information about the target population that RCT enrollment discards, provided the observational likelihood is appropriately down-weighted.</w:t>
+      </w:r>
+    </w:p>
     <w:p>
       <w:pPr>
         <w:pStyle w:val="Heading3"/>
@@ -4973,7 +5631,7 @@
           <w:sz w:val="24"/>
           <w:szCs w:val="24"/>
         </w:rPr>
-        <w:t xml:space="preserve">, and is illustrated with real, well-documented cases rather than synthetic examples. The modular design allows each component to be used independently.</w:t>
+        <w:t xml:space="preserve">, and is illustrated with real, well-documented cases. The operating-characteristics simulation is fully transparent---parameters, generative process, and metrics are reported explicitly---and it confirms that the power-prior combination rule can improve estimation and power under the specified structural information loss. The modular design allows each component to be used independently.</w:t>
       </w:r>
     </w:p>
     <w:p xmlns:a="http://schemas.openxmlformats.org/drawingml/2006/main" xmlns:pic="http://schemas.openxmlformats.org/drawingml/2006/picture">
@@ -5072,6 +5730,20 @@
           <w:szCs w:val="24"/>
         </w:rPr>
         <w:t xml:space="preserve">Prospective validation against trials whose results are not yet known would be stronger.</w:t>
+      </w:r>
+    </w:p>
+    <w:p xmlns:a="http://schemas.openxmlformats.org/drawingml/2006/main" xmlns:pic="http://schemas.openxmlformats.org/drawingml/2006/picture">
+      <w:pPr>
+        <w:pStyle w:val="List Bullet"/>
+        <w:spacing w:line="480" w:lineRule="auto" w:after="120"/>
+      </w:pPr>
+      <w:r>
+        <w:rPr>
+          <w:rFonts w:ascii="Times New Roman" w:hAnsi="Times New Roman" w:cs="Times New Roman" w:eastAsia="Times New Roman"/>
+          <w:sz w:val="24"/>
+          <w:szCs w:val="24"/>
+        </w:rPr>
+        <w:t xml:space="preserve">The operating-characteristics simulation is intentionally stylized: it uses a single data-generating model with risk-dependent effects, one selection mechanism, and normal-approximation power priors. It demonstrates that KOTHA can improve operating characteristics under transparent assumptions, but it does not establish general optimality of any fixed discounting factor.</w:t>
       </w:r>
     </w:p>
     <w:p xmlns:a="http://schemas.openxmlformats.org/drawingml/2006/main" xmlns:pic="http://schemas.openxmlformats.org/drawingml/2006/picture">

</xml_diff>